<commit_message>
fix: add NABL/ISO 15189 alongside CLSI and CAP citations (AAC6)
CLSI PRE02 (specimen collection) and CAP Q-TRACKS (TAT monitoring) were
the only cited standards, with no Indian lab-accreditation reference.
Added notes pointing to NABL/ISO 15189 as the equally acceptable Indian
basis, and updated the outsourcing step to prefer NABL-accredited labs.

Co-Authored-By: Claude Sonnet 5 <noreply@anthropic.com>
Claude-Session: https://claude.ai/code/session_01TPRLtLhmTCP5z94Q3FiE5v
</commit_message>
<xml_diff>
--- a/policies/build/chapters_v2/AAC/document/AAC6/SOP_Specimen_Handling_Reporting.docx
+++ b/policies/build/chapters_v2/AAC/document/AAC6/SOP_Specimen_Handling_Reporting.docx
@@ -321,26 +321,17 @@
     </w:p>
     <w:p>
       <w:r>
-        <w:t xml:space="preserve">Requisitioning Doctor: </w:t>
-      </w:r>
-      <w:r>
-        <w:t>orders the correct test with adequate clinical information.</w:t>
+        <w:t xml:space="preserve">Requisitioning Doctor: orders the correct test with adequate clinical information.</w:t>
       </w:r>
     </w:p>
     <w:p>
       <w:r>
-        <w:t xml:space="preserve">Collecting Staff (nurse/phlebotomist): </w:t>
-      </w:r>
-      <w:r>
-        <w:t>verifies two identifiers, labels correctly, and follows written collection guidance.</w:t>
+        <w:t xml:space="preserve">Collecting Staff (nurse/phlebotomist): verifies two identifiers, labels correctly, and follows written collection guidance.</w:t>
       </w:r>
     </w:p>
     <w:p>
       <w:r>
-        <w:t xml:space="preserve">Laboratory In-Charge: </w:t>
-      </w:r>
-      <w:r>
-        <w:t>defines TAT per test and monitors compliance.</w:t>
+        <w:t xml:space="preserve">Laboratory In-Charge: defines TAT per test and monitors compliance.</w:t>
       </w:r>
     </w:p>
     <w:p>
@@ -420,6 +411,14 @@
     </w:p>
     <w:p>
       <w:pPr>
+        <w:pStyle w:val="ListParagraph"/>
+      </w:pPr>
+      <w:r>
+        <w:t>Note: CLSI PRE02 is cited for collection technique only. NABH does not mandate this specific guideline — ISO 15189 (the standard NABL accreditation is based on) and the hospital’s own validated collection procedure are equally acceptable.</w:t>
+      </w:r>
+    </w:p>
+    <w:p>
+      <w:pPr>
         <w:pStyle w:val="Heading2"/>
       </w:pPr>
       <w:r>
@@ -477,6 +476,14 @@
     </w:p>
     <w:p>
       <w:pPr>
+        <w:pStyle w:val="ListParagraph"/>
+      </w:pPr>
+      <w:r>
+        <w:t>Note: CLSI PRE02 is cited for collection technique only. NABH does not mandate this specific guideline — ISO 15189 (the standard NABL accreditation is based on) and the hospital’s own validated collection procedure are equally acceptable.</w:t>
+      </w:r>
+    </w:p>
+    <w:p>
+      <w:pPr>
         <w:pStyle w:val="Heading2"/>
       </w:pPr>
       <w:r>
@@ -528,6 +535,14 @@
           <w:sz w:val="18"/>
         </w:rPr>
         <w:t>College of American Pathologists. (n.d.). Q-Tracks: A College of American Pathologists program of continuous laboratory monitoring and longitudinal performance tracking.</w:t>
+      </w:r>
+    </w:p>
+    <w:p>
+      <w:pPr>
+        <w:pStyle w:val="ListParagraph"/>
+      </w:pPr>
+      <w:r>
+        <w:t>Note: CAP Q-TRACKS is cited as one example of a structured TAT-monitoring programme, not as a mandated external benchmark. NABL-accredited laboratories run equivalent indicator monitoring under ISO 15189; either approach satisfies this requirement.</w:t>
       </w:r>
     </w:p>
     <w:p>
@@ -588,7 +603,7 @@
     </w:p>
     <w:p>
       <w:r>
-        <w:t>1. Outsource only to a laboratory with a documented quality assurance system and a current MoU with this hospital.</w:t>
+        <w:t>1. Outsource only to a laboratory with a documented quality assurance system and a current MoU with this hospital — preferably one accredited by NABL (National Accreditation Board for Testing and Calibration Laboratories) under ISO 15189.</w:t>
       </w:r>
     </w:p>
     <w:p>

</xml_diff>